<commit_message>
[SUPER DUPER Mercury, Venus, Earth, Mars, Jupiter, Saturn, Uranus, and Neptune UPDATE]
</commit_message>
<xml_diff>
--- a/Document/About Last Monkey In Space.docx
+++ b/Document/About Last Monkey In Space.docx
@@ -726,12 +726,7 @@
     </w:p>
     <w:p>
       <w:r>
-        <w:t>Ngay đầu trận, trải dài khắp Grid từ nhà Monkey sang nhà Allen là các cây chuối con(Banana Pub), những cây chuối nay không sản sinh ra được chuối do còn nhỏ. Cây chuối con là một Monkey Tower, có health</w:t>
-      </w:r>
-    </w:p>
-    <w:p>
-      <w:r>
-        <w:t>Để có chuối cho phe Monkey, ta cần phải cử các Builder chạy ra nơi có Banana Pub,  để tưới nước và bón phân, sau một thời gian, cây sẽ lớn và có khả năng sản sinh chuối. Bạn sẽ dùng chuối đó để mua các lá bài</w:t>
+        <w:t>Phía Monkey sở hữu lá bài BananaTree, lá bài này thuộc loại Tower, nó sẽ tạo ra chuối sau mỗi một khoảng thời gian</w:t>
       </w:r>
     </w:p>
     <w:p>
@@ -825,34 +820,34 @@
         <w:pStyle w:val="Heading3"/>
       </w:pPr>
       <w:r>
+        <w:t>-Cơ chế 2: Random</w:t>
+      </w:r>
+      <w:r>
+        <w:t>(đang được cân nhắc áp dụng</w:t>
+      </w:r>
+      <w:r>
+        <w:t xml:space="preserve"> cho các chế độ khác</w:t>
+      </w:r>
+      <w:r>
+        <w:t>)</w:t>
+      </w:r>
+    </w:p>
+    <w:p>
+      <w:r>
+        <w:t>Trước khi vào trận, người chơi sẽ được chọn trước bộ bài(deck) gồm 15 lá bài. Bạn có thể dùng preset thay vì mỗi trận đấu phải chọn đi chọn lại</w:t>
+      </w:r>
+    </w:p>
+    <w:p>
+      <w:r>
+        <w:t xml:space="preserve">Trong trận đấu, bạn có thể “phù phép” một Allen bằng Trụ </w:t>
+      </w:r>
+      <w:r>
+        <w:t>phù phép(Enchanter). Trụ này không giết kẻ địch, nó “phù phép” một kẻ địch sau mỗi 7s. Nếu trong tay của người chơi đang cầm số lượng lá bài tối đa(10), trụ phù phép sẽ tạm ngưng hoạt động</w:t>
+      </w:r>
+    </w:p>
+    <w:p>
+      <w:r>
         <w:lastRenderedPageBreak/>
-        <w:t>-Cơ chế 2: Random</w:t>
-      </w:r>
-      <w:r>
-        <w:t>(đang được cân nhắc áp dụng</w:t>
-      </w:r>
-      <w:r>
-        <w:t xml:space="preserve"> cho các chế độ khác</w:t>
-      </w:r>
-      <w:r>
-        <w:t>)</w:t>
-      </w:r>
-    </w:p>
-    <w:p>
-      <w:r>
-        <w:t>Trước khi vào trận, người chơi sẽ được chọn trước bộ bài(deck) gồm 15 lá bài. Bạn có thể dùng preset thay vì mỗi trận đấu phải chọn đi chọn lại</w:t>
-      </w:r>
-    </w:p>
-    <w:p>
-      <w:r>
-        <w:t xml:space="preserve">Trong trận đấu, bạn có thể “phù phép” một Allen bằng Trụ </w:t>
-      </w:r>
-      <w:r>
-        <w:t>phù phép(Enchanter). Trụ này không giết kẻ địch, nó “phù phép” một kẻ địch sau mỗi 7s. Nếu trong tay của người chơi đang cầm số lượng lá bài tối đa(10), trụ phù phép sẽ tạm ngưng hoạt động</w:t>
-      </w:r>
-    </w:p>
-    <w:p>
-      <w:r>
         <w:t>Khi giết Enemy bị dính “phù phép”, chúng sẽ rơi ra một lá bài ngẫu nhiên trong bộ bài ban đầu. Lá bài ngẫu nhiên đó sau đó được đưa vào tay người chơi</w:t>
       </w:r>
     </w:p>
@@ -992,25 +987,25 @@
         <w:pStyle w:val="Heading2"/>
       </w:pPr>
       <w:r>
+        <w:t>Combination</w:t>
+      </w:r>
+    </w:p>
+    <w:p>
+      <w:r>
+        <w:t xml:space="preserve">Một bộ bài tốt sẽ thường có sự phối hợp tốt giữa các lá bài(Combination). Ví dụ: </w:t>
+      </w:r>
+    </w:p>
+    <w:p>
+      <w:r>
+        <w:t>-K</w:t>
+      </w:r>
+      <w:r>
+        <w:t>ết hợp lá bài sinh ra Monkey có tốc đánh cao với lá bài tăng sát thương(cộng thẳng vào chỉ số chứ không phải phần trăm)</w:t>
+      </w:r>
+    </w:p>
+    <w:p>
+      <w:r>
         <w:lastRenderedPageBreak/>
-        <w:t>Combination</w:t>
-      </w:r>
-    </w:p>
-    <w:p>
-      <w:r>
-        <w:t xml:space="preserve">Một bộ bài tốt sẽ thường có sự phối hợp tốt giữa các lá bài(Combination). Ví dụ: </w:t>
-      </w:r>
-    </w:p>
-    <w:p>
-      <w:r>
-        <w:t>-K</w:t>
-      </w:r>
-      <w:r>
-        <w:t>ết hợp lá bài sinh ra Monkey có tốc đánh cao với lá bài tăng sát thương(cộng thẳng vào chỉ số chứ không phải phần trăm)</w:t>
-      </w:r>
-    </w:p>
-    <w:p>
-      <w:r>
         <w:t>-Kết hợp Mortal(cơ chế giống hệt máy bắn dưa trong PvZ) với lá bài làm chậm để có được một Trụ giống hệt dưa băng trong PvZ, có khả năng làm chậm đám đông</w:t>
       </w:r>
     </w:p>
@@ -1062,14 +1057,407 @@
         <w:t xml:space="preserve">Để counter đội hình thiên tốc đánh, ta có thể sử dụng Gargantuar throwing imp: tích nội tại dựa trên lượng đòn đánh nhận phải </w:t>
       </w:r>
     </w:p>
-    <w:p/>
-    <w:p/>
-    <w:p/>
     <w:p>
       <w:pPr>
         <w:pStyle w:val="Heading1"/>
       </w:pPr>
       <w:r>
+        <w:t>Hệ thống tiền tệ</w:t>
+      </w:r>
+    </w:p>
+    <w:p>
+      <w:pPr>
+        <w:pStyle w:val="Heading2"/>
+      </w:pPr>
+      <w:r>
+        <w:t>Gold</w:t>
+      </w:r>
+    </w:p>
+    <w:p>
+      <w:r>
+        <w:t>Thu được sau khi thắng ván đấu, ván đấu càng khó thì gold thu được càng nhiều</w:t>
+      </w:r>
+    </w:p>
+    <w:p>
+      <w:r>
+        <w:t xml:space="preserve">Được dùng để mua shard cho các lá bài Common, Uncommon, Rare. </w:t>
+      </w:r>
+    </w:p>
+    <w:p>
+      <w:r>
+        <w:t xml:space="preserve">Được dùng để mua thẻ thử cho các lá bài Epic, Exotic, Legendary. </w:t>
+      </w:r>
+    </w:p>
+    <w:p>
+      <w:r>
+        <w:t>Được dùng để thử vận may với Lucky Tree</w:t>
+      </w:r>
+    </w:p>
+    <w:p>
+      <w:pPr>
+        <w:pStyle w:val="Heading2"/>
+      </w:pPr>
+      <w:r>
+        <w:t>Diamond</w:t>
+      </w:r>
+    </w:p>
+    <w:p>
+      <w:r>
+        <w:t>Thu được từ việc hoàn thành các nhiệm vụ từ bảng tin, và từ các mốc quà trong chế độ Rank</w:t>
+      </w:r>
+    </w:p>
+    <w:p>
+      <w:r>
+        <w:t>Đây là tài nguyên hiếm</w:t>
+      </w:r>
+    </w:p>
+    <w:p>
+      <w:r>
+        <w:t>Được dùng để mua shard cho các lá bài Epic, Exotic, Legendary, gói VIP</w:t>
+      </w:r>
+    </w:p>
+    <w:p>
+      <w:r>
+        <w:t>Được dùng để thử vận may với Casinô</w:t>
+      </w:r>
+    </w:p>
+    <w:p>
+      <w:pPr>
+        <w:pStyle w:val="Heading1"/>
+      </w:pPr>
+      <w:r>
+        <w:lastRenderedPageBreak/>
+        <w:t>Hệ thống nâng cấp</w:t>
+      </w:r>
+    </w:p>
+    <w:p>
+      <w:r>
+        <w:t>Khi người chơi sở hữu đủ mảnh của một lá bài, người chơi có thể quy đổi thành sở hữu lá bài đó VĨNH VIỄN</w:t>
+      </w:r>
+    </w:p>
+    <w:p>
+      <w:r>
+        <w:t>Người chơi vẫn có thể sưu tập thêm mảnh(shard) của lá bài đó, nếu đạt mốc nhất định thì có thể dùng để nâng cấp lá bài. Lá bài sẽ được nhận</w:t>
+      </w:r>
+      <w:r>
+        <w:t xml:space="preserve"> một trong số các danh mục sau:</w:t>
+      </w:r>
+    </w:p>
+    <w:p>
+      <w:pPr>
+        <w:pStyle w:val="ListParagraph"/>
+        <w:numPr>
+          <w:ilvl w:val="0"/>
+          <w:numId w:val="12"/>
+        </w:numPr>
+      </w:pPr>
+      <w:r>
+        <w:t>Máu tối đa</w:t>
+      </w:r>
+    </w:p>
+    <w:p>
+      <w:pPr>
+        <w:pStyle w:val="ListParagraph"/>
+        <w:numPr>
+          <w:ilvl w:val="0"/>
+          <w:numId w:val="12"/>
+        </w:numPr>
+      </w:pPr>
+      <w:r>
+        <w:t>Giáp và kháng phép</w:t>
+      </w:r>
+    </w:p>
+    <w:p>
+      <w:pPr>
+        <w:pStyle w:val="ListParagraph"/>
+        <w:numPr>
+          <w:ilvl w:val="0"/>
+          <w:numId w:val="12"/>
+        </w:numPr>
+      </w:pPr>
+      <w:r>
+        <w:t>Sức mạnh/Sức mạnh phép thuật</w:t>
+      </w:r>
+    </w:p>
+    <w:p>
+      <w:pPr>
+        <w:pStyle w:val="ListParagraph"/>
+        <w:numPr>
+          <w:ilvl w:val="0"/>
+          <w:numId w:val="12"/>
+        </w:numPr>
+      </w:pPr>
+      <w:r>
+        <w:t>Skill mới</w:t>
+      </w:r>
+      <w:r>
+        <w:t>/Nâng cấp</w:t>
+      </w:r>
+      <w:r>
+        <w:t xml:space="preserve"> chỉ số của</w:t>
+      </w:r>
+      <w:r>
+        <w:t xml:space="preserve"> skill</w:t>
+      </w:r>
+    </w:p>
+    <w:p>
+      <w:r>
+        <w:t xml:space="preserve">Lá bài có thể được nâng cấp tối đa </w:t>
+      </w:r>
+      <w:r>
+        <w:t>4</w:t>
+      </w:r>
+      <w:r>
+        <w:t xml:space="preserve"> lần. </w:t>
+      </w:r>
+      <w:r>
+        <w:t xml:space="preserve">Lần nâng cấp thứ </w:t>
+      </w:r>
+      <w:r>
+        <w:t>2</w:t>
+      </w:r>
+      <w:r>
+        <w:t xml:space="preserve"> </w:t>
+      </w:r>
+      <w:r>
+        <w:t xml:space="preserve">và thứ 5 </w:t>
+      </w:r>
+      <w:r>
+        <w:t>sẽ mở khóa cơ chế mới cho lá bài. Ví dụ với thẻ bài Slimz sẽ mở khóa cơ chế kẻ địch bị choáng bởi Poke sẽ nhận thêm 25% sát thương từ mọi nguồn. Các lần nâng cấp còn lại là buff chỉ số đơn thuần</w:t>
+      </w:r>
+    </w:p>
+    <w:p>
+      <w:r>
+        <w:t xml:space="preserve">Số lượng mảnh cần để mở khóa một lá bài là </w:t>
+      </w:r>
+      <w:r>
+        <w:t>20</w:t>
+      </w:r>
+      <w:r>
+        <w:t xml:space="preserve"> hay tăng thêm một level đều là 20</w:t>
+      </w:r>
+      <w:r>
+        <w:t>.</w:t>
+      </w:r>
+    </w:p>
+    <w:p>
+      <w:r>
+        <w:t>Level tối đa là 6. Level 6 là level đặc biệt, có tên gọi khác là Mastery level. Level này chỉ tồn tại trong vòng 14 ngày kể từ khi nâng cấp</w:t>
+      </w:r>
+      <w:r>
+        <w:t>, Entity đạt cấp 6 sẽ có nhiệm vụ đặc biệt</w:t>
+      </w:r>
+    </w:p>
+    <w:p>
+      <w:r>
+        <w:t xml:space="preserve">Sau khi lá bài được nâng cấp đến mức tối đa, lá bài sẽ có sức mạnh bằng </w:t>
+      </w:r>
+      <w:r>
+        <w:t xml:space="preserve">khoảng </w:t>
+      </w:r>
+      <w:r>
+        <w:t>1.5 lần sức mạnh khi chưa nâng cấp</w:t>
+      </w:r>
+      <w:r>
+        <w:t xml:space="preserve">. </w:t>
+      </w:r>
+      <w:r>
+        <w:t>Shar</w:t>
+      </w:r>
+    </w:p>
+    <w:p>
+      <w:r>
+        <w:t xml:space="preserve">Ví dụ Basic Monkey, các nâng cấp theo thứ tự là: </w:t>
+      </w:r>
+    </w:p>
+    <w:p>
+      <w:pPr>
+        <w:pStyle w:val="ListParagraph"/>
+        <w:numPr>
+          <w:ilvl w:val="0"/>
+          <w:numId w:val="12"/>
+        </w:numPr>
+      </w:pPr>
+      <w:r>
+        <w:t>Strength tăng</w:t>
+      </w:r>
+      <w:r>
+        <w:t xml:space="preserve"> </w:t>
+      </w:r>
+      <w:r>
+        <w:t xml:space="preserve">thêm </w:t>
+      </w:r>
+      <w:r>
+        <w:t>5</w:t>
+      </w:r>
+    </w:p>
+    <w:p>
+      <w:pPr>
+        <w:pStyle w:val="ListParagraph"/>
+        <w:numPr>
+          <w:ilvl w:val="0"/>
+          <w:numId w:val="12"/>
+        </w:numPr>
+      </w:pPr>
+      <w:r>
+        <w:t xml:space="preserve">Passive mới: </w:t>
+      </w:r>
+      <w:r>
+        <w:t>Bầy đàn</w:t>
+      </w:r>
+      <w:r>
+        <w:t xml:space="preserve"> – </w:t>
+      </w:r>
+      <w:r>
+        <w:t xml:space="preserve">Với mỗi Basic Monkey trên battlefield, lượng giáp của Monkey được tăng thêm [ArmorIncreasedAmount = </w:t>
+      </w:r>
+      <w:r>
+        <w:t>8</w:t>
+      </w:r>
+      <w:r>
+        <w:t>%</w:t>
+      </w:r>
+      <w:r>
+        <w:t>]</w:t>
+      </w:r>
+    </w:p>
+    <w:p>
+      <w:pPr>
+        <w:pStyle w:val="ListParagraph"/>
+        <w:numPr>
+          <w:ilvl w:val="0"/>
+          <w:numId w:val="12"/>
+        </w:numPr>
+      </w:pPr>
+      <w:r>
+        <w:t xml:space="preserve">MaxHealth tăng </w:t>
+      </w:r>
+      <w:r>
+        <w:t xml:space="preserve">thêm </w:t>
+      </w:r>
+      <w:r>
+        <w:t>40</w:t>
+      </w:r>
+    </w:p>
+    <w:p>
+      <w:pPr>
+        <w:pStyle w:val="ListParagraph"/>
+        <w:numPr>
+          <w:ilvl w:val="0"/>
+          <w:numId w:val="12"/>
+        </w:numPr>
+      </w:pPr>
+      <w:r>
+        <w:t>[ArmorIncreasedAmount]</w:t>
+      </w:r>
+      <w:r>
+        <w:t xml:space="preserve"> tăng thêm </w:t>
+      </w:r>
+      <w:r>
+        <w:t>4</w:t>
+      </w:r>
+      <w:r>
+        <w:t>%</w:t>
+      </w:r>
+    </w:p>
+    <w:p>
+      <w:pPr>
+        <w:pStyle w:val="ListParagraph"/>
+        <w:numPr>
+          <w:ilvl w:val="0"/>
+          <w:numId w:val="12"/>
+        </w:numPr>
+      </w:pPr>
+      <w:r>
+        <w:t xml:space="preserve">Passive mới: </w:t>
+      </w:r>
+      <w:r>
+        <w:t>Quân Elite xuất hiện với tỉ lệ 1</w:t>
+      </w:r>
+      <w:r>
+        <w:t>0</w:t>
+      </w:r>
+      <w:r>
+        <w:t>%</w:t>
+      </w:r>
+    </w:p>
+    <w:p>
+      <w:r>
+        <w:t>Basic Alien</w:t>
+      </w:r>
+    </w:p>
+    <w:p>
+      <w:pPr>
+        <w:pStyle w:val="ListParagraph"/>
+        <w:numPr>
+          <w:ilvl w:val="0"/>
+          <w:numId w:val="12"/>
+        </w:numPr>
+      </w:pPr>
+      <w:r>
+        <w:t>Strength tăng thêm 5</w:t>
+      </w:r>
+    </w:p>
+    <w:p>
+      <w:pPr>
+        <w:pStyle w:val="ListParagraph"/>
+        <w:numPr>
+          <w:ilvl w:val="0"/>
+          <w:numId w:val="12"/>
+        </w:numPr>
+      </w:pPr>
+      <w:r>
+        <w:t xml:space="preserve">Passive mới: </w:t>
+      </w:r>
+      <w:r>
+        <w:t>Tân tiến – Có [Chance = 15]% cơ hội Basic Alien sẽ đội Cranium helmet</w:t>
+      </w:r>
+    </w:p>
+    <w:p>
+      <w:pPr>
+        <w:pStyle w:val="ListParagraph"/>
+        <w:numPr>
+          <w:ilvl w:val="0"/>
+          <w:numId w:val="12"/>
+        </w:numPr>
+      </w:pPr>
+      <w:r>
+        <w:t>MaxHealth tăng thêm 40</w:t>
+      </w:r>
+    </w:p>
+    <w:p>
+      <w:pPr>
+        <w:pStyle w:val="ListParagraph"/>
+        <w:numPr>
+          <w:ilvl w:val="0"/>
+          <w:numId w:val="12"/>
+        </w:numPr>
+      </w:pPr>
+      <w:r>
+        <w:t>[Chance] tăng thêm 8%</w:t>
+      </w:r>
+    </w:p>
+    <w:p>
+      <w:pPr>
+        <w:pStyle w:val="ListParagraph"/>
+        <w:numPr>
+          <w:ilvl w:val="0"/>
+          <w:numId w:val="12"/>
+        </w:numPr>
+      </w:pPr>
+      <w:r>
+        <w:t xml:space="preserve">Passive mới: </w:t>
+      </w:r>
+      <w:r>
+        <w:t>Quân Elite xuất hiện với tỉ lệ 10%</w:t>
+      </w:r>
+    </w:p>
+    <w:p>
+      <w:pPr>
+        <w:pStyle w:val="Heading1"/>
+      </w:pPr>
+      <w:r>
+        <w:lastRenderedPageBreak/>
         <w:t>Assembly definition</w:t>
       </w:r>
     </w:p>
@@ -1087,7 +1475,6 @@
           <w:b/>
           <w:bCs/>
         </w:rPr>
-        <w:lastRenderedPageBreak/>
         <w:t>Core</w:t>
       </w:r>
       <w:r>
@@ -1239,6 +1626,7 @@
     </w:p>
     <w:p>
       <w:r>
+        <w:lastRenderedPageBreak/>
         <w:t xml:space="preserve">Hãy nghiên cứu: Entity là đối tượng tạo ra viên đạn, nhưng viên đạn lại là thứ va chạm với Entity </w:t>
       </w:r>
       <w:r>
@@ -1274,7 +1662,6 @@
         <w:pStyle w:val="Heading1"/>
       </w:pPr>
       <w:r>
-        <w:lastRenderedPageBreak/>
         <w:t>Phân tích ngoài lề</w:t>
       </w:r>
     </w:p>
@@ -2658,6 +3045,118 @@
     </w:lvl>
   </w:abstractNum>
   <w:abstractNum w:abstractNumId="10" w15:restartNumberingAfterBreak="0">
+    <w:nsid w:val="6CF36FB6"/>
+    <w:multiLevelType w:val="hybridMultilevel"/>
+    <w:tmpl w:val="76A04486"/>
+    <w:lvl w:ilvl="0" w:tplc="33A22750">
+      <w:numFmt w:val="bullet"/>
+      <w:lvlText w:val="-"/>
+      <w:lvlJc w:val="left"/>
+      <w:pPr>
+        <w:ind w:left="720" w:hanging="360"/>
+      </w:pPr>
+      <w:rPr>
+        <w:rFonts w:ascii="Aptos" w:eastAsiaTheme="minorHAnsi" w:hAnsi="Aptos" w:cstheme="minorBidi" w:hint="default"/>
+      </w:rPr>
+    </w:lvl>
+    <w:lvl w:ilvl="1" w:tplc="04090003" w:tentative="1">
+      <w:start w:val="1"/>
+      <w:numFmt w:val="bullet"/>
+      <w:lvlText w:val="o"/>
+      <w:lvlJc w:val="left"/>
+      <w:pPr>
+        <w:ind w:left="1440" w:hanging="360"/>
+      </w:pPr>
+      <w:rPr>
+        <w:rFonts w:ascii="Courier New" w:hAnsi="Courier New" w:cs="Courier New" w:hint="default"/>
+      </w:rPr>
+    </w:lvl>
+    <w:lvl w:ilvl="2" w:tplc="04090005" w:tentative="1">
+      <w:start w:val="1"/>
+      <w:numFmt w:val="bullet"/>
+      <w:lvlText w:val=""/>
+      <w:lvlJc w:val="left"/>
+      <w:pPr>
+        <w:ind w:left="2160" w:hanging="360"/>
+      </w:pPr>
+      <w:rPr>
+        <w:rFonts w:ascii="Wingdings" w:hAnsi="Wingdings" w:hint="default"/>
+      </w:rPr>
+    </w:lvl>
+    <w:lvl w:ilvl="3" w:tplc="04090001" w:tentative="1">
+      <w:start w:val="1"/>
+      <w:numFmt w:val="bullet"/>
+      <w:lvlText w:val=""/>
+      <w:lvlJc w:val="left"/>
+      <w:pPr>
+        <w:ind w:left="2880" w:hanging="360"/>
+      </w:pPr>
+      <w:rPr>
+        <w:rFonts w:ascii="Symbol" w:hAnsi="Symbol" w:hint="default"/>
+      </w:rPr>
+    </w:lvl>
+    <w:lvl w:ilvl="4" w:tplc="04090003" w:tentative="1">
+      <w:start w:val="1"/>
+      <w:numFmt w:val="bullet"/>
+      <w:lvlText w:val="o"/>
+      <w:lvlJc w:val="left"/>
+      <w:pPr>
+        <w:ind w:left="3600" w:hanging="360"/>
+      </w:pPr>
+      <w:rPr>
+        <w:rFonts w:ascii="Courier New" w:hAnsi="Courier New" w:cs="Courier New" w:hint="default"/>
+      </w:rPr>
+    </w:lvl>
+    <w:lvl w:ilvl="5" w:tplc="04090005" w:tentative="1">
+      <w:start w:val="1"/>
+      <w:numFmt w:val="bullet"/>
+      <w:lvlText w:val=""/>
+      <w:lvlJc w:val="left"/>
+      <w:pPr>
+        <w:ind w:left="4320" w:hanging="360"/>
+      </w:pPr>
+      <w:rPr>
+        <w:rFonts w:ascii="Wingdings" w:hAnsi="Wingdings" w:hint="default"/>
+      </w:rPr>
+    </w:lvl>
+    <w:lvl w:ilvl="6" w:tplc="04090001" w:tentative="1">
+      <w:start w:val="1"/>
+      <w:numFmt w:val="bullet"/>
+      <w:lvlText w:val=""/>
+      <w:lvlJc w:val="left"/>
+      <w:pPr>
+        <w:ind w:left="5040" w:hanging="360"/>
+      </w:pPr>
+      <w:rPr>
+        <w:rFonts w:ascii="Symbol" w:hAnsi="Symbol" w:hint="default"/>
+      </w:rPr>
+    </w:lvl>
+    <w:lvl w:ilvl="7" w:tplc="04090003" w:tentative="1">
+      <w:start w:val="1"/>
+      <w:numFmt w:val="bullet"/>
+      <w:lvlText w:val="o"/>
+      <w:lvlJc w:val="left"/>
+      <w:pPr>
+        <w:ind w:left="5760" w:hanging="360"/>
+      </w:pPr>
+      <w:rPr>
+        <w:rFonts w:ascii="Courier New" w:hAnsi="Courier New" w:cs="Courier New" w:hint="default"/>
+      </w:rPr>
+    </w:lvl>
+    <w:lvl w:ilvl="8" w:tplc="04090005" w:tentative="1">
+      <w:start w:val="1"/>
+      <w:numFmt w:val="bullet"/>
+      <w:lvlText w:val=""/>
+      <w:lvlJc w:val="left"/>
+      <w:pPr>
+        <w:ind w:left="6480" w:hanging="360"/>
+      </w:pPr>
+      <w:rPr>
+        <w:rFonts w:ascii="Wingdings" w:hAnsi="Wingdings" w:hint="default"/>
+      </w:rPr>
+    </w:lvl>
+  </w:abstractNum>
+  <w:abstractNum w:abstractNumId="11" w15:restartNumberingAfterBreak="0">
     <w:nsid w:val="6F0C7DEB"/>
     <w:multiLevelType w:val="multilevel"/>
     <w:tmpl w:val="075CC112"/>
@@ -2819,7 +3318,7 @@
     <w:abstractNumId w:val="3"/>
   </w:num>
   <w:num w:numId="5" w16cid:durableId="964121963">
-    <w:abstractNumId w:val="10"/>
+    <w:abstractNumId w:val="11"/>
   </w:num>
   <w:num w:numId="6" w16cid:durableId="1692291657">
     <w:abstractNumId w:val="4"/>
@@ -2838,6 +3337,9 @@
   </w:num>
   <w:num w:numId="11" w16cid:durableId="763723119">
     <w:abstractNumId w:val="6"/>
+  </w:num>
+  <w:num w:numId="12" w16cid:durableId="680277349">
+    <w:abstractNumId w:val="10"/>
   </w:num>
 </w:numbering>
 </file>

</xml_diff>